<commit_message>
done testing in lab for LPD/LPI ROC slash
</commit_message>
<xml_diff>
--- a/Work notes - Quantitative Evaluation of LoRa RF Resiliency.docx
+++ b/Work notes - Quantitative Evaluation of LoRa RF Resiliency.docx
@@ -1142,17 +1142,19 @@
       <w:tblPr>
         <w:tblStyle w:val="TableGrid"/>
         <w:tblW w:w="0" w:type="auto"/>
+        <w:tblInd w:w="-995" w:type="dxa"/>
         <w:tblLook w:val="04A0" w:firstRow="1" w:lastRow="0" w:firstColumn="1" w:lastColumn="0" w:noHBand="0" w:noVBand="1"/>
       </w:tblPr>
       <w:tblGrid>
-        <w:gridCol w:w="535"/>
-        <w:gridCol w:w="987"/>
-        <w:gridCol w:w="1229"/>
-        <w:gridCol w:w="1097"/>
-        <w:gridCol w:w="1493"/>
-        <w:gridCol w:w="1229"/>
-        <w:gridCol w:w="1463"/>
-        <w:gridCol w:w="1317"/>
+        <w:gridCol w:w="538"/>
+        <w:gridCol w:w="1171"/>
+        <w:gridCol w:w="991"/>
+        <w:gridCol w:w="1080"/>
+        <w:gridCol w:w="1440"/>
+        <w:gridCol w:w="1080"/>
+        <w:gridCol w:w="1440"/>
+        <w:gridCol w:w="1440"/>
+        <w:gridCol w:w="1165"/>
       </w:tblGrid>
       <w:tr>
         <w:trPr>
@@ -1160,7 +1162,7 @@
         </w:trPr>
         <w:tc>
           <w:tcPr>
-            <w:tcW w:w="535" w:type="dxa"/>
+            <w:tcW w:w="538" w:type="dxa"/>
             <w:noWrap/>
             <w:hideMark/>
           </w:tcPr>
@@ -1172,7 +1174,7 @@
         </w:tc>
         <w:tc>
           <w:tcPr>
-            <w:tcW w:w="987" w:type="dxa"/>
+            <w:tcW w:w="1171" w:type="dxa"/>
             <w:noWrap/>
             <w:hideMark/>
           </w:tcPr>
@@ -1184,7 +1186,7 @@
         </w:tc>
         <w:tc>
           <w:tcPr>
-            <w:tcW w:w="1229" w:type="dxa"/>
+            <w:tcW w:w="991" w:type="dxa"/>
             <w:noWrap/>
             <w:hideMark/>
           </w:tcPr>
@@ -1196,7 +1198,7 @@
         </w:tc>
         <w:tc>
           <w:tcPr>
-            <w:tcW w:w="1097" w:type="dxa"/>
+            <w:tcW w:w="1080" w:type="dxa"/>
             <w:noWrap/>
             <w:hideMark/>
           </w:tcPr>
@@ -1221,7 +1223,7 @@
         </w:tc>
         <w:tc>
           <w:tcPr>
-            <w:tcW w:w="1493" w:type="dxa"/>
+            <w:tcW w:w="1440" w:type="dxa"/>
             <w:noWrap/>
             <w:hideMark/>
           </w:tcPr>
@@ -1241,7 +1243,7 @@
         </w:tc>
         <w:tc>
           <w:tcPr>
-            <w:tcW w:w="1229" w:type="dxa"/>
+            <w:tcW w:w="1080" w:type="dxa"/>
             <w:noWrap/>
             <w:hideMark/>
           </w:tcPr>
@@ -1253,7 +1255,7 @@
         </w:tc>
         <w:tc>
           <w:tcPr>
-            <w:tcW w:w="1463" w:type="dxa"/>
+            <w:tcW w:w="1440" w:type="dxa"/>
             <w:noWrap/>
             <w:hideMark/>
           </w:tcPr>
@@ -1265,7 +1267,17 @@
         </w:tc>
         <w:tc>
           <w:tcPr>
-            <w:tcW w:w="1317" w:type="dxa"/>
+            <w:tcW w:w="1440" w:type="dxa"/>
+          </w:tcPr>
+          <w:p>
+            <w:r>
+              <w:t>Thermal noise est</w:t>
+            </w:r>
+          </w:p>
+        </w:tc>
+        <w:tc>
+          <w:tcPr>
+            <w:tcW w:w="1165" w:type="dxa"/>
             <w:noWrap/>
             <w:hideMark/>
           </w:tcPr>
@@ -1282,7 +1294,7 @@
         </w:trPr>
         <w:tc>
           <w:tcPr>
-            <w:tcW w:w="535" w:type="dxa"/>
+            <w:tcW w:w="538" w:type="dxa"/>
             <w:noWrap/>
             <w:hideMark/>
           </w:tcPr>
@@ -1294,7 +1306,7 @@
         </w:tc>
         <w:tc>
           <w:tcPr>
-            <w:tcW w:w="987" w:type="dxa"/>
+            <w:tcW w:w="1171" w:type="dxa"/>
             <w:noWrap/>
             <w:hideMark/>
           </w:tcPr>
@@ -1306,7 +1318,7 @@
         </w:tc>
         <w:tc>
           <w:tcPr>
-            <w:tcW w:w="1229" w:type="dxa"/>
+            <w:tcW w:w="991" w:type="dxa"/>
             <w:noWrap/>
             <w:hideMark/>
           </w:tcPr>
@@ -1318,7 +1330,7 @@
         </w:tc>
         <w:tc>
           <w:tcPr>
-            <w:tcW w:w="1097" w:type="dxa"/>
+            <w:tcW w:w="1080" w:type="dxa"/>
             <w:noWrap/>
             <w:hideMark/>
           </w:tcPr>
@@ -1330,7 +1342,7 @@
         </w:tc>
         <w:tc>
           <w:tcPr>
-            <w:tcW w:w="1493" w:type="dxa"/>
+            <w:tcW w:w="1440" w:type="dxa"/>
             <w:noWrap/>
             <w:hideMark/>
           </w:tcPr>
@@ -1342,7 +1354,7 @@
         </w:tc>
         <w:tc>
           <w:tcPr>
-            <w:tcW w:w="1229" w:type="dxa"/>
+            <w:tcW w:w="1080" w:type="dxa"/>
             <w:noWrap/>
             <w:hideMark/>
           </w:tcPr>
@@ -1354,7 +1366,7 @@
         </w:tc>
         <w:tc>
           <w:tcPr>
-            <w:tcW w:w="1463" w:type="dxa"/>
+            <w:tcW w:w="1440" w:type="dxa"/>
             <w:noWrap/>
             <w:hideMark/>
           </w:tcPr>
@@ -1366,7 +1378,13 @@
         </w:tc>
         <w:tc>
           <w:tcPr>
-            <w:tcW w:w="1317" w:type="dxa"/>
+            <w:tcW w:w="1440" w:type="dxa"/>
+          </w:tcPr>
+          <w:p/>
+        </w:tc>
+        <w:tc>
+          <w:tcPr>
+            <w:tcW w:w="1165" w:type="dxa"/>
             <w:noWrap/>
             <w:hideMark/>
           </w:tcPr>
@@ -1383,7 +1401,7 @@
         </w:trPr>
         <w:tc>
           <w:tcPr>
-            <w:tcW w:w="535" w:type="dxa"/>
+            <w:tcW w:w="538" w:type="dxa"/>
             <w:noWrap/>
             <w:hideMark/>
           </w:tcPr>
@@ -1395,7 +1413,7 @@
         </w:tc>
         <w:tc>
           <w:tcPr>
-            <w:tcW w:w="987" w:type="dxa"/>
+            <w:tcW w:w="1171" w:type="dxa"/>
             <w:noWrap/>
             <w:hideMark/>
           </w:tcPr>
@@ -1410,7 +1428,7 @@
         </w:tc>
         <w:tc>
           <w:tcPr>
-            <w:tcW w:w="1229" w:type="dxa"/>
+            <w:tcW w:w="991" w:type="dxa"/>
             <w:noWrap/>
             <w:hideMark/>
           </w:tcPr>
@@ -1422,7 +1440,7 @@
         </w:tc>
         <w:tc>
           <w:tcPr>
-            <w:tcW w:w="1097" w:type="dxa"/>
+            <w:tcW w:w="1080" w:type="dxa"/>
             <w:noWrap/>
             <w:hideMark/>
           </w:tcPr>
@@ -1434,7 +1452,7 @@
         </w:tc>
         <w:tc>
           <w:tcPr>
-            <w:tcW w:w="1493" w:type="dxa"/>
+            <w:tcW w:w="1440" w:type="dxa"/>
             <w:noWrap/>
             <w:hideMark/>
           </w:tcPr>
@@ -1446,7 +1464,7 @@
         </w:tc>
         <w:tc>
           <w:tcPr>
-            <w:tcW w:w="1229" w:type="dxa"/>
+            <w:tcW w:w="1080" w:type="dxa"/>
             <w:noWrap/>
             <w:hideMark/>
           </w:tcPr>
@@ -1458,7 +1476,7 @@
         </w:tc>
         <w:tc>
           <w:tcPr>
-            <w:tcW w:w="1463" w:type="dxa"/>
+            <w:tcW w:w="1440" w:type="dxa"/>
             <w:noWrap/>
             <w:hideMark/>
           </w:tcPr>
@@ -1470,7 +1488,13 @@
         </w:tc>
         <w:tc>
           <w:tcPr>
-            <w:tcW w:w="1317" w:type="dxa"/>
+            <w:tcW w:w="1440" w:type="dxa"/>
+          </w:tcPr>
+          <w:p/>
+        </w:tc>
+        <w:tc>
+          <w:tcPr>
+            <w:tcW w:w="1165" w:type="dxa"/>
             <w:noWrap/>
             <w:hideMark/>
           </w:tcPr>
@@ -1487,7 +1511,7 @@
         </w:trPr>
         <w:tc>
           <w:tcPr>
-            <w:tcW w:w="535" w:type="dxa"/>
+            <w:tcW w:w="538" w:type="dxa"/>
             <w:noWrap/>
             <w:hideMark/>
           </w:tcPr>
@@ -1499,7 +1523,7 @@
         </w:tc>
         <w:tc>
           <w:tcPr>
-            <w:tcW w:w="987" w:type="dxa"/>
+            <w:tcW w:w="1171" w:type="dxa"/>
             <w:noWrap/>
             <w:hideMark/>
           </w:tcPr>
@@ -1514,7 +1538,7 @@
         </w:tc>
         <w:tc>
           <w:tcPr>
-            <w:tcW w:w="1229" w:type="dxa"/>
+            <w:tcW w:w="991" w:type="dxa"/>
             <w:noWrap/>
             <w:hideMark/>
           </w:tcPr>
@@ -1526,7 +1550,7 @@
         </w:tc>
         <w:tc>
           <w:tcPr>
-            <w:tcW w:w="1097" w:type="dxa"/>
+            <w:tcW w:w="1080" w:type="dxa"/>
             <w:noWrap/>
             <w:hideMark/>
           </w:tcPr>
@@ -1538,7 +1562,7 @@
         </w:tc>
         <w:tc>
           <w:tcPr>
-            <w:tcW w:w="1493" w:type="dxa"/>
+            <w:tcW w:w="1440" w:type="dxa"/>
             <w:noWrap/>
             <w:hideMark/>
           </w:tcPr>
@@ -1550,7 +1574,7 @@
         </w:tc>
         <w:tc>
           <w:tcPr>
-            <w:tcW w:w="1229" w:type="dxa"/>
+            <w:tcW w:w="1080" w:type="dxa"/>
             <w:noWrap/>
             <w:hideMark/>
           </w:tcPr>
@@ -1562,7 +1586,7 @@
         </w:tc>
         <w:tc>
           <w:tcPr>
-            <w:tcW w:w="1463" w:type="dxa"/>
+            <w:tcW w:w="1440" w:type="dxa"/>
             <w:noWrap/>
             <w:hideMark/>
           </w:tcPr>
@@ -1574,7 +1598,13 @@
         </w:tc>
         <w:tc>
           <w:tcPr>
-            <w:tcW w:w="1317" w:type="dxa"/>
+            <w:tcW w:w="1440" w:type="dxa"/>
+          </w:tcPr>
+          <w:p/>
+        </w:tc>
+        <w:tc>
+          <w:tcPr>
+            <w:tcW w:w="1165" w:type="dxa"/>
             <w:noWrap/>
             <w:hideMark/>
           </w:tcPr>
@@ -1591,7 +1621,7 @@
         </w:trPr>
         <w:tc>
           <w:tcPr>
-            <w:tcW w:w="535" w:type="dxa"/>
+            <w:tcW w:w="538" w:type="dxa"/>
             <w:noWrap/>
             <w:hideMark/>
           </w:tcPr>
@@ -1603,7 +1633,7 @@
         </w:tc>
         <w:tc>
           <w:tcPr>
-            <w:tcW w:w="987" w:type="dxa"/>
+            <w:tcW w:w="1171" w:type="dxa"/>
             <w:noWrap/>
             <w:hideMark/>
           </w:tcPr>
@@ -1615,7 +1645,7 @@
         </w:tc>
         <w:tc>
           <w:tcPr>
-            <w:tcW w:w="1229" w:type="dxa"/>
+            <w:tcW w:w="991" w:type="dxa"/>
             <w:noWrap/>
             <w:hideMark/>
           </w:tcPr>
@@ -1627,7 +1657,7 @@
         </w:tc>
         <w:tc>
           <w:tcPr>
-            <w:tcW w:w="1097" w:type="dxa"/>
+            <w:tcW w:w="1080" w:type="dxa"/>
             <w:noWrap/>
             <w:hideMark/>
           </w:tcPr>
@@ -1639,7 +1669,7 @@
         </w:tc>
         <w:tc>
           <w:tcPr>
-            <w:tcW w:w="1493" w:type="dxa"/>
+            <w:tcW w:w="1440" w:type="dxa"/>
             <w:noWrap/>
             <w:hideMark/>
           </w:tcPr>
@@ -1651,7 +1681,7 @@
         </w:tc>
         <w:tc>
           <w:tcPr>
-            <w:tcW w:w="1229" w:type="dxa"/>
+            <w:tcW w:w="1080" w:type="dxa"/>
             <w:noWrap/>
             <w:hideMark/>
           </w:tcPr>
@@ -1663,7 +1693,7 @@
         </w:tc>
         <w:tc>
           <w:tcPr>
-            <w:tcW w:w="1463" w:type="dxa"/>
+            <w:tcW w:w="1440" w:type="dxa"/>
             <w:noWrap/>
             <w:hideMark/>
           </w:tcPr>
@@ -1675,7 +1705,13 @@
         </w:tc>
         <w:tc>
           <w:tcPr>
-            <w:tcW w:w="1317" w:type="dxa"/>
+            <w:tcW w:w="1440" w:type="dxa"/>
+          </w:tcPr>
+          <w:p/>
+        </w:tc>
+        <w:tc>
+          <w:tcPr>
+            <w:tcW w:w="1165" w:type="dxa"/>
             <w:noWrap/>
             <w:hideMark/>
           </w:tcPr>
@@ -1692,7 +1728,7 @@
         </w:trPr>
         <w:tc>
           <w:tcPr>
-            <w:tcW w:w="535" w:type="dxa"/>
+            <w:tcW w:w="538" w:type="dxa"/>
             <w:noWrap/>
             <w:hideMark/>
           </w:tcPr>
@@ -1704,7 +1740,7 @@
         </w:tc>
         <w:tc>
           <w:tcPr>
-            <w:tcW w:w="987" w:type="dxa"/>
+            <w:tcW w:w="1171" w:type="dxa"/>
             <w:noWrap/>
             <w:hideMark/>
           </w:tcPr>
@@ -1716,7 +1752,7 @@
         </w:tc>
         <w:tc>
           <w:tcPr>
-            <w:tcW w:w="1229" w:type="dxa"/>
+            <w:tcW w:w="991" w:type="dxa"/>
             <w:noWrap/>
             <w:hideMark/>
           </w:tcPr>
@@ -1728,7 +1764,7 @@
         </w:tc>
         <w:tc>
           <w:tcPr>
-            <w:tcW w:w="1097" w:type="dxa"/>
+            <w:tcW w:w="1080" w:type="dxa"/>
             <w:noWrap/>
             <w:hideMark/>
           </w:tcPr>
@@ -1740,7 +1776,7 @@
         </w:tc>
         <w:tc>
           <w:tcPr>
-            <w:tcW w:w="1493" w:type="dxa"/>
+            <w:tcW w:w="1440" w:type="dxa"/>
             <w:noWrap/>
             <w:hideMark/>
           </w:tcPr>
@@ -1752,7 +1788,7 @@
         </w:tc>
         <w:tc>
           <w:tcPr>
-            <w:tcW w:w="1229" w:type="dxa"/>
+            <w:tcW w:w="1080" w:type="dxa"/>
             <w:noWrap/>
             <w:hideMark/>
           </w:tcPr>
@@ -1764,7 +1800,7 @@
         </w:tc>
         <w:tc>
           <w:tcPr>
-            <w:tcW w:w="1463" w:type="dxa"/>
+            <w:tcW w:w="1440" w:type="dxa"/>
             <w:noWrap/>
             <w:hideMark/>
           </w:tcPr>
@@ -1776,7 +1812,13 @@
         </w:tc>
         <w:tc>
           <w:tcPr>
-            <w:tcW w:w="1317" w:type="dxa"/>
+            <w:tcW w:w="1440" w:type="dxa"/>
+          </w:tcPr>
+          <w:p/>
+        </w:tc>
+        <w:tc>
+          <w:tcPr>
+            <w:tcW w:w="1165" w:type="dxa"/>
             <w:noWrap/>
             <w:hideMark/>
           </w:tcPr>
@@ -1793,7 +1835,7 @@
         </w:trPr>
         <w:tc>
           <w:tcPr>
-            <w:tcW w:w="535" w:type="dxa"/>
+            <w:tcW w:w="538" w:type="dxa"/>
             <w:noWrap/>
             <w:hideMark/>
           </w:tcPr>
@@ -1805,7 +1847,7 @@
         </w:tc>
         <w:tc>
           <w:tcPr>
-            <w:tcW w:w="987" w:type="dxa"/>
+            <w:tcW w:w="1171" w:type="dxa"/>
             <w:noWrap/>
             <w:hideMark/>
           </w:tcPr>
@@ -1817,7 +1859,7 @@
         </w:tc>
         <w:tc>
           <w:tcPr>
-            <w:tcW w:w="1229" w:type="dxa"/>
+            <w:tcW w:w="991" w:type="dxa"/>
             <w:noWrap/>
             <w:hideMark/>
           </w:tcPr>
@@ -1829,7 +1871,7 @@
         </w:tc>
         <w:tc>
           <w:tcPr>
-            <w:tcW w:w="1097" w:type="dxa"/>
+            <w:tcW w:w="1080" w:type="dxa"/>
             <w:noWrap/>
             <w:hideMark/>
           </w:tcPr>
@@ -1841,7 +1883,7 @@
         </w:tc>
         <w:tc>
           <w:tcPr>
-            <w:tcW w:w="1493" w:type="dxa"/>
+            <w:tcW w:w="1440" w:type="dxa"/>
             <w:noWrap/>
             <w:hideMark/>
           </w:tcPr>
@@ -1853,7 +1895,7 @@
         </w:tc>
         <w:tc>
           <w:tcPr>
-            <w:tcW w:w="1229" w:type="dxa"/>
+            <w:tcW w:w="1080" w:type="dxa"/>
             <w:noWrap/>
             <w:hideMark/>
           </w:tcPr>
@@ -1865,7 +1907,7 @@
         </w:tc>
         <w:tc>
           <w:tcPr>
-            <w:tcW w:w="1463" w:type="dxa"/>
+            <w:tcW w:w="1440" w:type="dxa"/>
             <w:noWrap/>
             <w:hideMark/>
           </w:tcPr>
@@ -1877,7 +1919,13 @@
         </w:tc>
         <w:tc>
           <w:tcPr>
-            <w:tcW w:w="1317" w:type="dxa"/>
+            <w:tcW w:w="1440" w:type="dxa"/>
+          </w:tcPr>
+          <w:p/>
+        </w:tc>
+        <w:tc>
+          <w:tcPr>
+            <w:tcW w:w="1165" w:type="dxa"/>
             <w:noWrap/>
             <w:hideMark/>
           </w:tcPr>
@@ -1894,7 +1942,7 @@
         </w:trPr>
         <w:tc>
           <w:tcPr>
-            <w:tcW w:w="535" w:type="dxa"/>
+            <w:tcW w:w="538" w:type="dxa"/>
             <w:noWrap/>
             <w:hideMark/>
           </w:tcPr>
@@ -1906,7 +1954,7 @@
         </w:tc>
         <w:tc>
           <w:tcPr>
-            <w:tcW w:w="987" w:type="dxa"/>
+            <w:tcW w:w="1171" w:type="dxa"/>
             <w:noWrap/>
             <w:hideMark/>
           </w:tcPr>
@@ -1918,7 +1966,7 @@
         </w:tc>
         <w:tc>
           <w:tcPr>
-            <w:tcW w:w="1229" w:type="dxa"/>
+            <w:tcW w:w="991" w:type="dxa"/>
             <w:noWrap/>
             <w:hideMark/>
           </w:tcPr>
@@ -1930,7 +1978,7 @@
         </w:tc>
         <w:tc>
           <w:tcPr>
-            <w:tcW w:w="1097" w:type="dxa"/>
+            <w:tcW w:w="1080" w:type="dxa"/>
             <w:noWrap/>
             <w:hideMark/>
           </w:tcPr>
@@ -1942,7 +1990,7 @@
         </w:tc>
         <w:tc>
           <w:tcPr>
-            <w:tcW w:w="1493" w:type="dxa"/>
+            <w:tcW w:w="1440" w:type="dxa"/>
             <w:noWrap/>
             <w:hideMark/>
           </w:tcPr>
@@ -1954,7 +2002,7 @@
         </w:tc>
         <w:tc>
           <w:tcPr>
-            <w:tcW w:w="1229" w:type="dxa"/>
+            <w:tcW w:w="1080" w:type="dxa"/>
             <w:noWrap/>
             <w:hideMark/>
           </w:tcPr>
@@ -1966,7 +2014,7 @@
         </w:tc>
         <w:tc>
           <w:tcPr>
-            <w:tcW w:w="1463" w:type="dxa"/>
+            <w:tcW w:w="1440" w:type="dxa"/>
             <w:noWrap/>
             <w:hideMark/>
           </w:tcPr>
@@ -1978,7 +2026,13 @@
         </w:tc>
         <w:tc>
           <w:tcPr>
-            <w:tcW w:w="1317" w:type="dxa"/>
+            <w:tcW w:w="1440" w:type="dxa"/>
+          </w:tcPr>
+          <w:p/>
+        </w:tc>
+        <w:tc>
+          <w:tcPr>
+            <w:tcW w:w="1165" w:type="dxa"/>
             <w:noWrap/>
             <w:hideMark/>
           </w:tcPr>
@@ -1995,7 +2049,7 @@
         </w:trPr>
         <w:tc>
           <w:tcPr>
-            <w:tcW w:w="535" w:type="dxa"/>
+            <w:tcW w:w="538" w:type="dxa"/>
             <w:noWrap/>
             <w:hideMark/>
           </w:tcPr>
@@ -2007,7 +2061,7 @@
         </w:tc>
         <w:tc>
           <w:tcPr>
-            <w:tcW w:w="987" w:type="dxa"/>
+            <w:tcW w:w="1171" w:type="dxa"/>
             <w:noWrap/>
             <w:hideMark/>
           </w:tcPr>
@@ -2019,7 +2073,7 @@
         </w:tc>
         <w:tc>
           <w:tcPr>
-            <w:tcW w:w="1229" w:type="dxa"/>
+            <w:tcW w:w="991" w:type="dxa"/>
             <w:noWrap/>
             <w:hideMark/>
           </w:tcPr>
@@ -2031,7 +2085,7 @@
         </w:tc>
         <w:tc>
           <w:tcPr>
-            <w:tcW w:w="1097" w:type="dxa"/>
+            <w:tcW w:w="1080" w:type="dxa"/>
             <w:noWrap/>
             <w:hideMark/>
           </w:tcPr>
@@ -2043,7 +2097,7 @@
         </w:tc>
         <w:tc>
           <w:tcPr>
-            <w:tcW w:w="1493" w:type="dxa"/>
+            <w:tcW w:w="1440" w:type="dxa"/>
             <w:noWrap/>
             <w:hideMark/>
           </w:tcPr>
@@ -2055,7 +2109,7 @@
         </w:tc>
         <w:tc>
           <w:tcPr>
-            <w:tcW w:w="1229" w:type="dxa"/>
+            <w:tcW w:w="1080" w:type="dxa"/>
             <w:noWrap/>
             <w:hideMark/>
           </w:tcPr>
@@ -2067,7 +2121,7 @@
         </w:tc>
         <w:tc>
           <w:tcPr>
-            <w:tcW w:w="1463" w:type="dxa"/>
+            <w:tcW w:w="1440" w:type="dxa"/>
             <w:noWrap/>
             <w:hideMark/>
           </w:tcPr>
@@ -2079,7 +2133,13 @@
         </w:tc>
         <w:tc>
           <w:tcPr>
-            <w:tcW w:w="1317" w:type="dxa"/>
+            <w:tcW w:w="1440" w:type="dxa"/>
+          </w:tcPr>
+          <w:p/>
+        </w:tc>
+        <w:tc>
+          <w:tcPr>
+            <w:tcW w:w="1165" w:type="dxa"/>
             <w:noWrap/>
             <w:hideMark/>
           </w:tcPr>

</xml_diff>

<commit_message>
mid quarter update work
</commit_message>
<xml_diff>
--- a/Work notes - Quantitative Evaluation of LoRa RF Resiliency.docx
+++ b/Work notes - Quantitative Evaluation of LoRa RF Resiliency.docx
@@ -1141,7 +1141,7 @@
     <w:tbl>
       <w:tblPr>
         <w:tblStyle w:val="TableGrid"/>
-        <w:tblW w:w="11340" w:type="dxa"/>
+        <w:tblW w:w="9990" w:type="dxa"/>
         <w:tblInd w:w="-995" w:type="dxa"/>
         <w:tblLook w:val="04A0" w:firstRow="1" w:lastRow="0" w:firstColumn="1" w:lastColumn="0" w:noHBand="0" w:noVBand="1"/>
       </w:tblPr>
@@ -1154,7 +1154,6 @@
         <w:gridCol w:w="990"/>
         <w:gridCol w:w="1260"/>
         <w:gridCol w:w="1350"/>
-        <w:gridCol w:w="1350"/>
         <w:gridCol w:w="1710"/>
       </w:tblGrid>
       <w:tr>
@@ -1278,12 +1277,6 @@
         </w:tc>
         <w:tc>
           <w:tcPr>
-            <w:tcW w:w="1350" w:type="dxa"/>
-          </w:tcPr>
-          <w:p/>
-        </w:tc>
-        <w:tc>
-          <w:tcPr>
             <w:tcW w:w="1710" w:type="dxa"/>
             <w:noWrap/>
             <w:hideMark/>
@@ -1395,12 +1388,6 @@
         </w:tc>
         <w:tc>
           <w:tcPr>
-            <w:tcW w:w="1350" w:type="dxa"/>
-          </w:tcPr>
-          <w:p/>
-        </w:tc>
-        <w:tc>
-          <w:tcPr>
             <w:tcW w:w="1710" w:type="dxa"/>
             <w:noWrap/>
             <w:hideMark/>
@@ -1512,12 +1499,6 @@
         </w:tc>
         <w:tc>
           <w:tcPr>
-            <w:tcW w:w="1350" w:type="dxa"/>
-          </w:tcPr>
-          <w:p/>
-        </w:tc>
-        <w:tc>
-          <w:tcPr>
             <w:tcW w:w="1710" w:type="dxa"/>
             <w:noWrap/>
             <w:hideMark/>
@@ -1629,12 +1610,6 @@
         </w:tc>
         <w:tc>
           <w:tcPr>
-            <w:tcW w:w="1350" w:type="dxa"/>
-          </w:tcPr>
-          <w:p/>
-        </w:tc>
-        <w:tc>
-          <w:tcPr>
             <w:tcW w:w="1710" w:type="dxa"/>
             <w:noWrap/>
             <w:hideMark/>
@@ -1746,12 +1721,6 @@
         </w:tc>
         <w:tc>
           <w:tcPr>
-            <w:tcW w:w="1350" w:type="dxa"/>
-          </w:tcPr>
-          <w:p/>
-        </w:tc>
-        <w:tc>
-          <w:tcPr>
             <w:tcW w:w="1710" w:type="dxa"/>
             <w:noWrap/>
             <w:hideMark/>
@@ -1917,11 +1886,22 @@
                 <w:strike/>
               </w:rPr>
             </w:pPr>
-          </w:p>
-        </w:tc>
-        <w:tc>
-          <w:tcPr>
-            <w:tcW w:w="1350" w:type="dxa"/>
+            <w:r>
+              <w:t>-</w:t>
+            </w:r>
+            <w:r>
+              <w:rPr>
+                <w:strike/>
+              </w:rPr>
+              <w:t>133.6</w:t>
+            </w:r>
+          </w:p>
+        </w:tc>
+        <w:tc>
+          <w:tcPr>
+            <w:tcW w:w="1710" w:type="dxa"/>
+            <w:noWrap/>
+            <w:hideMark/>
           </w:tcPr>
           <w:p>
             <w:pPr>
@@ -1929,20 +1909,6 @@
                 <w:strike/>
               </w:rPr>
             </w:pPr>
-          </w:p>
-        </w:tc>
-        <w:tc>
-          <w:tcPr>
-            <w:tcW w:w="1710" w:type="dxa"/>
-            <w:noWrap/>
-            <w:hideMark/>
-          </w:tcPr>
-          <w:p>
-            <w:pPr>
-              <w:rPr>
-                <w:strike/>
-              </w:rPr>
-            </w:pPr>
             <w:r>
               <w:rPr>
                 <w:strike/>
@@ -2052,12 +2018,6 @@
         </w:tc>
         <w:tc>
           <w:tcPr>
-            <w:tcW w:w="1350" w:type="dxa"/>
-          </w:tcPr>
-          <w:p/>
-        </w:tc>
-        <w:tc>
-          <w:tcPr>
             <w:tcW w:w="1710" w:type="dxa"/>
             <w:noWrap/>
             <w:hideMark/>
@@ -2166,12 +2126,6 @@
               <w:t>-116.8</w:t>
             </w:r>
           </w:p>
-        </w:tc>
-        <w:tc>
-          <w:tcPr>
-            <w:tcW w:w="1350" w:type="dxa"/>
-          </w:tcPr>
-          <w:p/>
         </w:tc>
         <w:tc>
           <w:tcPr>

</xml_diff>